<commit_message>
Add mobile apps to BioPay, Salaryd and Canteen System
</commit_message>
<xml_diff>
--- a/files/Derrick-Barasa-Resume.docx
+++ b/files/Derrick-Barasa-Resume.docx
@@ -46,7 +46,7 @@
         </w:rPr>
         <w:t xml:space="preserve">Nairobi, Kenya | </w:t>
       </w:r>
-      <w:hyperlink w:history="1" r:id="rIdvly6ebp15zufgcn9n9jkg">
+      <w:hyperlink w:history="1" r:id="rIdyyeexmhelvo2efyiol-v2">
         <w:r>
           <w:rPr>
             <w:rStyle w:val="Hyperlink"/>
@@ -72,7 +72,7 @@
         <w:spacing w:after="40"/>
         <w:jc w:val="center"/>
       </w:pPr>
-      <w:hyperlink w:history="1" r:id="rIdeg4jtg0vyxm5gqxpcppdz">
+      <w:hyperlink w:history="1" r:id="rIdzdg4dbsowqjcd0glrhkfz">
         <w:r>
           <w:rPr>
             <w:rStyle w:val="Hyperlink"/>
@@ -92,7 +92,7 @@
         </w:rPr>
         <w:t xml:space="preserve"> | </w:t>
       </w:r>
-      <w:hyperlink w:history="1" r:id="rIdchkd-8sapwrez_puup7ip">
+      <w:hyperlink w:history="1" r:id="rIdk6qntsxb7jk73teqql7vw">
         <w:r>
           <w:rPr>
             <w:rStyle w:val="Hyperlink"/>
@@ -112,7 +112,7 @@
         </w:rPr>
         <w:t xml:space="preserve"> | </w:t>
       </w:r>
-      <w:hyperlink w:history="1" r:id="rIdgz3ofz10nzj5pihocs-ce">
+      <w:hyperlink w:history="1" r:id="rIddb_ir7awgo4rffxkrbs63">
         <w:r>
           <w:rPr>
             <w:rStyle w:val="Hyperlink"/>
@@ -539,7 +539,7 @@
         </w:rPr>
         <w:t xml:space="preserve">  ·  </w:t>
       </w:r>
-      <w:hyperlink w:history="1" r:id="rIduuwb00xte8ii5fiqvr4dg">
+      <w:hyperlink w:history="1" r:id="rIdv2ecp1xxgcpxnbarpagq_">
         <w:r>
           <w:rPr>
             <w:rStyle w:val="Hyperlink"/>
@@ -590,6 +590,24 @@
     </w:p>
     <w:p>
       <w:pPr>
+        <w:pStyle w:val="ListParagraph"/>
+        <w:numPr>
+          <w:ilvl w:val="0"/>
+          <w:numId w:val="2"/>
+        </w:numPr>
+        <w:spacing w:after="40"/>
+      </w:pPr>
+      <w:r>
+        <w:rPr>
+          <w:rFonts w:ascii="Calibri" w:cs="Calibri" w:eastAsia="Calibri" w:hAnsi="Calibri"/>
+          <w:sz w:val="21"/>
+          <w:szCs w:val="21"/>
+        </w:rPr>
+        <w:t xml:space="preserve">Built the Android mobile app in Kotlin, distributed as an APK downloaded from the platform dashboard.</w:t>
+      </w:r>
+    </w:p>
+    <w:p>
+      <w:pPr>
         <w:keepNext/>
         <w:spacing w:after="20" w:before="100"/>
       </w:pPr>
@@ -621,7 +639,7 @@
         </w:rPr>
         <w:t xml:space="preserve">  ·  </w:t>
       </w:r>
-      <w:hyperlink w:history="1" r:id="rIdq7rejatiam6f9cth9hkfz">
+      <w:hyperlink w:history="1" r:id="rIdgcdf2-9f6ex_enztlty3a">
         <w:r>
           <w:rPr>
             <w:rStyle w:val="Hyperlink"/>
@@ -703,7 +721,7 @@
         </w:rPr>
         <w:t xml:space="preserve">  ·  </w:t>
       </w:r>
-      <w:hyperlink w:history="1" r:id="rIdfon8isvowiboeld1ppbso">
+      <w:hyperlink w:history="1" r:id="rIduyythqtnc_b42xwgnybpa">
         <w:r>
           <w:rPr>
             <w:rStyle w:val="Hyperlink"/>
@@ -754,6 +772,24 @@
     </w:p>
     <w:p>
       <w:pPr>
+        <w:pStyle w:val="ListParagraph"/>
+        <w:numPr>
+          <w:ilvl w:val="0"/>
+          <w:numId w:val="2"/>
+        </w:numPr>
+        <w:spacing w:after="40"/>
+      </w:pPr>
+      <w:r>
+        <w:rPr>
+          <w:rFonts w:ascii="Calibri" w:cs="Calibri" w:eastAsia="Calibri" w:hAnsi="Calibri"/>
+          <w:sz w:val="21"/>
+          <w:szCs w:val="21"/>
+        </w:rPr>
+        <w:t xml:space="preserve">Built the Android mobile app in Flutter, distributed as an APK downloaded from the platform dashboard.</w:t>
+      </w:r>
+    </w:p>
+    <w:p>
+      <w:pPr>
         <w:keepNext/>
         <w:spacing w:after="20" w:before="100"/>
       </w:pPr>
@@ -785,7 +821,7 @@
         </w:rPr>
         <w:t xml:space="preserve">  ·  </w:t>
       </w:r>
-      <w:hyperlink w:history="1" r:id="rId1wjhyyuuhwfo5isjzkyyp">
+      <w:hyperlink w:history="1" r:id="rIda_2sk_lmp6td2xymkc73v">
         <w:r>
           <w:rPr>
             <w:rStyle w:val="Hyperlink"/>
@@ -867,7 +903,7 @@
         </w:rPr>
         <w:t xml:space="preserve">  ·  </w:t>
       </w:r>
-      <w:hyperlink w:history="1" r:id="rIdepdcefqdba9ftvdkpwh8b">
+      <w:hyperlink w:history="1" r:id="rIdmxqy2mhe4p37dadv86bzc">
         <w:r>
           <w:rPr>
             <w:rStyle w:val="Hyperlink"/>
@@ -1128,6 +1164,24 @@
           <w:szCs w:val="21"/>
         </w:rPr>
         <w:t xml:space="preserve">Point-of-sale and order routing with digital menu management, role-based order processing and meal ticket issuance (Java Vert.x, Vue.js, PostgreSQL).</w:t>
+      </w:r>
+    </w:p>
+    <w:p>
+      <w:pPr>
+        <w:pStyle w:val="ListParagraph"/>
+        <w:numPr>
+          <w:ilvl w:val="0"/>
+          <w:numId w:val="2"/>
+        </w:numPr>
+        <w:spacing w:after="40"/>
+      </w:pPr>
+      <w:r>
+        <w:rPr>
+          <w:rFonts w:ascii="Calibri" w:cs="Calibri" w:eastAsia="Calibri" w:hAnsi="Calibri"/>
+          <w:sz w:val="21"/>
+          <w:szCs w:val="21"/>
+        </w:rPr>
+        <w:t xml:space="preserve">Companion mobile app built with Flutter.</w:t>
       </w:r>
     </w:p>
     <w:p>

</xml_diff>

<commit_message>
Add experience section, availability line and data tools
</commit_message>
<xml_diff>
--- a/files/Derrick-Barasa-Resume.docx
+++ b/files/Derrick-Barasa-Resume.docx
@@ -46,7 +46,7 @@
         </w:rPr>
         <w:t xml:space="preserve">Nairobi, Kenya | </w:t>
       </w:r>
-      <w:hyperlink w:history="1" r:id="rIdyyeexmhelvo2efyiol-v2">
+      <w:hyperlink w:history="1" r:id="rIdoyyxiasra4glh6jsjzcpe">
         <w:r>
           <w:rPr>
             <w:rStyle w:val="Hyperlink"/>
@@ -72,7 +72,7 @@
         <w:spacing w:after="40"/>
         <w:jc w:val="center"/>
       </w:pPr>
-      <w:hyperlink w:history="1" r:id="rIdzdg4dbsowqjcd0glrhkfz">
+      <w:hyperlink w:history="1" r:id="rIdwizmvtofeqen3f59dhhl9">
         <w:r>
           <w:rPr>
             <w:rStyle w:val="Hyperlink"/>
@@ -92,7 +92,7 @@
         </w:rPr>
         <w:t xml:space="preserve"> | </w:t>
       </w:r>
-      <w:hyperlink w:history="1" r:id="rIdk6qntsxb7jk73teqql7vw">
+      <w:hyperlink w:history="1" r:id="rIdxa_qcoi4ifkzjwheooakl">
         <w:r>
           <w:rPr>
             <w:rStyle w:val="Hyperlink"/>
@@ -112,7 +112,7 @@
         </w:rPr>
         <w:t xml:space="preserve"> | </w:t>
       </w:r>
-      <w:hyperlink w:history="1" r:id="rIddb_ir7awgo4rffxkrbs63">
+      <w:hyperlink w:history="1" r:id="rIdqyph904_nmb39pc67tou3">
         <w:r>
           <w:rPr>
             <w:rStyle w:val="Hyperlink"/>
@@ -305,6 +305,34 @@
           <w:sz w:val="21"/>
           <w:szCs w:val="21"/>
         </w:rPr>
+        <w:t xml:space="preserve">Data &amp; Compliance: </w:t>
+      </w:r>
+      <w:r>
+        <w:rPr>
+          <w:rFonts w:ascii="Calibri" w:cs="Calibri" w:eastAsia="Calibri" w:hAnsi="Calibri"/>
+          <w:sz w:val="21"/>
+          <w:szCs w:val="21"/>
+        </w:rPr>
+        <w:t xml:space="preserve">Power BI, Python (pandas), Excel</w:t>
+      </w:r>
+    </w:p>
+    <w:p>
+      <w:pPr>
+        <w:pStyle w:val="ListParagraph"/>
+        <w:numPr>
+          <w:ilvl w:val="0"/>
+          <w:numId w:val="2"/>
+        </w:numPr>
+        <w:spacing w:after="40"/>
+      </w:pPr>
+      <w:r>
+        <w:rPr>
+          <w:rFonts w:ascii="Calibri" w:cs="Calibri" w:eastAsia="Calibri" w:hAnsi="Calibri"/>
+          <w:b/>
+          <w:bCs/>
+          <w:sz w:val="21"/>
+          <w:szCs w:val="21"/>
+        </w:rPr>
         <w:t xml:space="preserve">Mobile: </w:t>
       </w:r>
       <w:r>
@@ -440,7 +468,7 @@
           <w:sz w:val="21"/>
           <w:szCs w:val="21"/>
         </w:rPr>
-        <w:t xml:space="preserve">Handled compliance work and data analysis.</w:t>
+        <w:t xml:space="preserve">Compliance work using Excel, and data analysis using Power BI and Python (pandas).</w:t>
       </w:r>
     </w:p>
     <w:p>
@@ -539,7 +567,7 @@
         </w:rPr>
         <w:t xml:space="preserve">  ·  </w:t>
       </w:r>
-      <w:hyperlink w:history="1" r:id="rIdv2ecp1xxgcpxnbarpagq_">
+      <w:hyperlink w:history="1" r:id="rIdnz2e-jjq1vzzhfdygfpvx">
         <w:r>
           <w:rPr>
             <w:rStyle w:val="Hyperlink"/>
@@ -639,7 +667,7 @@
         </w:rPr>
         <w:t xml:space="preserve">  ·  </w:t>
       </w:r>
-      <w:hyperlink w:history="1" r:id="rIdgcdf2-9f6ex_enztlty3a">
+      <w:hyperlink w:history="1" r:id="rId7sxx9zzdt4rjqfyy-twv6">
         <w:r>
           <w:rPr>
             <w:rStyle w:val="Hyperlink"/>
@@ -721,7 +749,7 @@
         </w:rPr>
         <w:t xml:space="preserve">  ·  </w:t>
       </w:r>
-      <w:hyperlink w:history="1" r:id="rIduyythqtnc_b42xwgnybpa">
+      <w:hyperlink w:history="1" r:id="rIdn-jfqook5mxcwekjatxbq">
         <w:r>
           <w:rPr>
             <w:rStyle w:val="Hyperlink"/>
@@ -821,7 +849,7 @@
         </w:rPr>
         <w:t xml:space="preserve">  ·  </w:t>
       </w:r>
-      <w:hyperlink w:history="1" r:id="rIda_2sk_lmp6td2xymkc73v">
+      <w:hyperlink w:history="1" r:id="rIdx9zu49lftl4khne1w21w0">
         <w:r>
           <w:rPr>
             <w:rStyle w:val="Hyperlink"/>
@@ -903,7 +931,7 @@
         </w:rPr>
         <w:t xml:space="preserve">  ·  </w:t>
       </w:r>
-      <w:hyperlink w:history="1" r:id="rIdmxqy2mhe4p37dadv86bzc">
+      <w:hyperlink w:history="1" r:id="rIdogubspem_5xz4sv-xq7_n">
         <w:r>
           <w:rPr>
             <w:rStyle w:val="Hyperlink"/>

</xml_diff>

<commit_message>
Clarify RemitCore internship work, add CountComply, version stylesheet
</commit_message>
<xml_diff>
--- a/files/Derrick-Barasa-Resume.docx
+++ b/files/Derrick-Barasa-Resume.docx
@@ -46,7 +46,7 @@
         </w:rPr>
         <w:t xml:space="preserve">Nairobi, Kenya | </w:t>
       </w:r>
-      <w:hyperlink w:history="1" r:id="rIdoyyxiasra4glh6jsjzcpe">
+      <w:hyperlink w:history="1" r:id="rId5oewoicb7nkakjmtfqbqb">
         <w:r>
           <w:rPr>
             <w:rStyle w:val="Hyperlink"/>
@@ -72,7 +72,7 @@
         <w:spacing w:after="40"/>
         <w:jc w:val="center"/>
       </w:pPr>
-      <w:hyperlink w:history="1" r:id="rIdwizmvtofeqen3f59dhhl9">
+      <w:hyperlink w:history="1" r:id="rIdruhwlm1e0zeo69sh4pe5r">
         <w:r>
           <w:rPr>
             <w:rStyle w:val="Hyperlink"/>
@@ -92,7 +92,7 @@
         </w:rPr>
         <w:t xml:space="preserve"> | </w:t>
       </w:r>
-      <w:hyperlink w:history="1" r:id="rIdxa_qcoi4ifkzjwheooakl">
+      <w:hyperlink w:history="1" r:id="rIdsbktths2svvxg60ungrmr">
         <w:r>
           <w:rPr>
             <w:rStyle w:val="Hyperlink"/>
@@ -112,7 +112,7 @@
         </w:rPr>
         <w:t xml:space="preserve"> | </w:t>
       </w:r>
-      <w:hyperlink w:history="1" r:id="rIdqyph904_nmb39pc67tou3">
+      <w:hyperlink w:history="1" r:id="rIdxio0zqmkmau7s7lccrbcr">
         <w:r>
           <w:rPr>
             <w:rStyle w:val="Hyperlink"/>
@@ -154,7 +154,7 @@
           <w:sz w:val="21"/>
           <w:szCs w:val="21"/>
         </w:rPr>
-        <w:t xml:space="preserve">Software Engineering student and full-stack developer with a 2025�2026 development internship at RemitCore, who builds scalable web platforms, financial tools and enterprise systems. Specialized in event-driven backends with Java Vert.x, web applications with Java and Laravel, mobile apps with Flutter and Kotlin, and reactive interfaces with Vue.js, Vuetify and Tailwind CSS, backed by PostgreSQL and MySQL. Has shipped five live platforms on custom domains, with a focus on modular design, database integrity and non-blocking asynchronous processing.</w:t>
+        <w:t xml:space="preserve">Software Engineering student and full-stack developer with a 2025–2026 development internship at RemitCore, who builds scalable web platforms, financial tools and enterprise systems. Specialized in event-driven backends with Java Vert.x, web applications with Java and Laravel, mobile apps with Flutter and Kotlin, and reactive interfaces with Vue.js, Vuetify and Tailwind CSS, backed by PostgreSQL and MySQL. Has shipped five live platforms on custom domains, with a focus on modular design, database integrity and non-blocking asynchronous processing.</w:t>
       </w:r>
     </w:p>
     <w:p>
@@ -422,25 +422,43 @@
           <w:sz w:val="21"/>
           <w:szCs w:val="21"/>
         </w:rPr>
-        <w:t xml:space="preserve">  �  2025 � 2026</w:t>
-      </w:r>
-    </w:p>
-    <w:p>
-      <w:pPr>
-        <w:pStyle w:val="ListParagraph"/>
-        <w:numPr>
-          <w:ilvl w:val="0"/>
-          <w:numId w:val="2"/>
-        </w:numPr>
-        <w:spacing w:after="40"/>
-      </w:pPr>
-      <w:r>
-        <w:rPr>
-          <w:rFonts w:ascii="Calibri" w:cs="Calibri" w:eastAsia="Calibri" w:hAnsi="Calibri"/>
-          <w:sz w:val="21"/>
-          <w:szCs w:val="21"/>
-        </w:rPr>
-        <w:t xml:space="preserve">Worked as part of the development team on RemitCore, a live money transfer and currency exchange platform.</w:t>
+        <w:t xml:space="preserve">  ·  2025 – 2026</w:t>
+      </w:r>
+    </w:p>
+    <w:p>
+      <w:pPr>
+        <w:pStyle w:val="ListParagraph"/>
+        <w:numPr>
+          <w:ilvl w:val="0"/>
+          <w:numId w:val="2"/>
+        </w:numPr>
+        <w:spacing w:after="40"/>
+      </w:pPr>
+      <w:r>
+        <w:rPr>
+          <w:rFonts w:ascii="Calibri" w:cs="Calibri" w:eastAsia="Calibri" w:hAnsi="Calibri"/>
+          <w:sz w:val="21"/>
+          <w:szCs w:val="21"/>
+        </w:rPr>
+        <w:t xml:space="preserve">Worked as part of the development team at RemitCore.</w:t>
+      </w:r>
+    </w:p>
+    <w:p>
+      <w:pPr>
+        <w:pStyle w:val="ListParagraph"/>
+        <w:numPr>
+          <w:ilvl w:val="0"/>
+          <w:numId w:val="2"/>
+        </w:numPr>
+        <w:spacing w:after="40"/>
+      </w:pPr>
+      <w:r>
+        <w:rPr>
+          <w:rFonts w:ascii="Calibri" w:cs="Calibri" w:eastAsia="Calibri" w:hAnsi="Calibri"/>
+          <w:sz w:val="21"/>
+          <w:szCs w:val="21"/>
+        </w:rPr>
+        <w:t xml:space="preserve">Worked on the RemitCore website and on CountComply, the AML/KYC and compliance management platform.</w:t>
       </w:r>
     </w:p>
     <w:p>
@@ -565,9 +583,9 @@
           <w:sz w:val="21"/>
           <w:szCs w:val="21"/>
         </w:rPr>
-        <w:t xml:space="preserve">  ·  </w:t>
-      </w:r>
-      <w:hyperlink w:history="1" r:id="rIdnz2e-jjq1vzzhfdygfpvx">
+        <w:t xml:space="preserve">  Â·  </w:t>
+      </w:r>
+      <w:hyperlink w:history="1" r:id="rIddq8r6sq5n94uamnx7kpjg">
         <w:r>
           <w:rPr>
             <w:rStyle w:val="Hyperlink"/>
@@ -665,9 +683,9 @@
           <w:sz w:val="21"/>
           <w:szCs w:val="21"/>
         </w:rPr>
-        <w:t xml:space="preserve">  ·  </w:t>
-      </w:r>
-      <w:hyperlink w:history="1" r:id="rId7sxx9zzdt4rjqfyy-twv6">
+        <w:t xml:space="preserve">  Â·  </w:t>
+      </w:r>
+      <w:hyperlink w:history="1" r:id="rIdlhlqp4zewiyhxnmyf7uaf">
         <w:r>
           <w:rPr>
             <w:rStyle w:val="Hyperlink"/>
@@ -713,7 +731,7 @@
           <w:sz w:val="21"/>
           <w:szCs w:val="21"/>
         </w:rPr>
-        <w:t xml:space="preserve">Built the transaction processing pipeline and secure API integrations for payouts (Java Vert.x, PostgreSQL).</w:t>
+        <w:t xml:space="preserve">Java Vert.x and PostgreSQL platform with secure API integrations for payouts.</w:t>
       </w:r>
     </w:p>
     <w:p>
@@ -747,9 +765,9 @@
           <w:sz w:val="21"/>
           <w:szCs w:val="21"/>
         </w:rPr>
-        <w:t xml:space="preserve">  ·  </w:t>
-      </w:r>
-      <w:hyperlink w:history="1" r:id="rIdn-jfqook5mxcwekjatxbq">
+        <w:t xml:space="preserve">  Â·  </w:t>
+      </w:r>
+      <w:hyperlink w:history="1" r:id="rIdvj7ykd2njffcv0ein8t_i">
         <w:r>
           <w:rPr>
             <w:rStyle w:val="Hyperlink"/>
@@ -847,9 +865,9 @@
           <w:sz w:val="21"/>
           <w:szCs w:val="21"/>
         </w:rPr>
-        <w:t xml:space="preserve">  ·  </w:t>
-      </w:r>
-      <w:hyperlink w:history="1" r:id="rIdx9zu49lftl4khne1w21w0">
+        <w:t xml:space="preserve">  Â·  </w:t>
+      </w:r>
+      <w:hyperlink w:history="1" r:id="rIduwnuxkr03sez5ik8hurpf">
         <w:r>
           <w:rPr>
             <w:rStyle w:val="Hyperlink"/>
@@ -929,9 +947,9 @@
           <w:sz w:val="21"/>
           <w:szCs w:val="21"/>
         </w:rPr>
-        <w:t xml:space="preserve">  ·  </w:t>
-      </w:r>
-      <w:hyperlink w:history="1" r:id="rIdogubspem_5xz4sv-xq7_n">
+        <w:t xml:space="preserve">  Â·  </w:t>
+      </w:r>
+      <w:hyperlink w:history="1" r:id="rId18v35omgprjkihduciaon">
         <w:r>
           <w:rPr>
             <w:rStyle w:val="Hyperlink"/>
@@ -1027,7 +1045,7 @@
           <w:sz w:val="21"/>
           <w:szCs w:val="21"/>
         </w:rPr>
-        <w:t xml:space="preserve">  ·  </w:t>
+        <w:t xml:space="preserve">  Â·  </w:t>
       </w:r>
       <w:r>
         <w:rPr>
@@ -1105,7 +1123,7 @@
           <w:sz w:val="21"/>
           <w:szCs w:val="21"/>
         </w:rPr>
-        <w:t xml:space="preserve">  ·  </w:t>
+        <w:t xml:space="preserve">  Â·  </w:t>
       </w:r>
       <w:r>
         <w:rPr>
@@ -1165,7 +1183,7 @@
           <w:sz w:val="21"/>
           <w:szCs w:val="21"/>
         </w:rPr>
-        <w:t xml:space="preserve">  ·  </w:t>
+        <w:t xml:space="preserve">  Â·  </w:t>
       </w:r>
       <w:r>
         <w:rPr>
@@ -1583,7 +1601,7 @@
     <w:lvl w:ilvl="0" w:tentative="1">
       <w:start w:val="1"/>
       <w:numFmt w:val="bullet"/>
-      <w:lvlText w:val="•"/>
+      <w:lvlText w:val="â€¢"/>
       <w:lvlJc w:val="left"/>
       <w:pPr>
         <w:ind w:left="360" w:hanging="220"/>

</xml_diff>

<commit_message>
Describe RemitCore as website work only
</commit_message>
<xml_diff>
--- a/files/Derrick-Barasa-Resume.docx
+++ b/files/Derrick-Barasa-Resume.docx
@@ -46,7 +46,7 @@
         </w:rPr>
         <w:t xml:space="preserve">Nairobi, Kenya | </w:t>
       </w:r>
-      <w:hyperlink w:history="1" r:id="rId5oewoicb7nkakjmtfqbqb">
+      <w:hyperlink w:history="1" r:id="rIde9-l0bs5oheahcukdfgy0">
         <w:r>
           <w:rPr>
             <w:rStyle w:val="Hyperlink"/>
@@ -72,7 +72,7 @@
         <w:spacing w:after="40"/>
         <w:jc w:val="center"/>
       </w:pPr>
-      <w:hyperlink w:history="1" r:id="rIdruhwlm1e0zeo69sh4pe5r">
+      <w:hyperlink w:history="1" r:id="rIdms2bh_tw3uzgfeqnk3-ji">
         <w:r>
           <w:rPr>
             <w:rStyle w:val="Hyperlink"/>
@@ -92,7 +92,7 @@
         </w:rPr>
         <w:t xml:space="preserve"> | </w:t>
       </w:r>
-      <w:hyperlink w:history="1" r:id="rIdsbktths2svvxg60ungrmr">
+      <w:hyperlink w:history="1" r:id="rIdrf2mpsttubz756mgqqhb-">
         <w:r>
           <w:rPr>
             <w:rStyle w:val="Hyperlink"/>
@@ -112,7 +112,7 @@
         </w:rPr>
         <w:t xml:space="preserve"> | </w:t>
       </w:r>
-      <w:hyperlink w:history="1" r:id="rIdxio0zqmkmau7s7lccrbcr">
+      <w:hyperlink w:history="1" r:id="rId2zmrvdfbz9yt87gtj4jki">
         <w:r>
           <w:rPr>
             <w:rStyle w:val="Hyperlink"/>
@@ -414,7 +414,7 @@
           <w:sz w:val="21"/>
           <w:szCs w:val="21"/>
         </w:rPr>
-        <w:t xml:space="preserve"> | RemitCore (money transfer platform)</w:t>
+        <w:t xml:space="preserve"> | RemitCore</w:t>
       </w:r>
       <w:r>
         <w:rPr>
@@ -549,7 +549,7 @@
           <w:sz w:val="21"/>
           <w:szCs w:val="21"/>
         </w:rPr>
-        <w:t xml:space="preserve">Live platforms</w:t>
+        <w:t xml:space="preserve">Live platforms and websites</w:t>
       </w:r>
     </w:p>
     <w:p>
@@ -585,7 +585,7 @@
         </w:rPr>
         <w:t xml:space="preserve">  Â·  </w:t>
       </w:r>
-      <w:hyperlink w:history="1" r:id="rIddq8r6sq5n94uamnx7kpjg">
+      <w:hyperlink w:history="1" r:id="rIdvxb8smcglqkndljzgxndp">
         <w:r>
           <w:rPr>
             <w:rStyle w:val="Hyperlink"/>
@@ -675,7 +675,7 @@
           <w:sz w:val="21"/>
           <w:szCs w:val="21"/>
         </w:rPr>
-        <w:t xml:space="preserve"> | FinTech</w:t>
+        <w:t xml:space="preserve"> | Website</w:t>
       </w:r>
       <w:r>
         <w:rPr>
@@ -685,7 +685,7 @@
         </w:rPr>
         <w:t xml:space="preserve">  Â·  </w:t>
       </w:r>
-      <w:hyperlink w:history="1" r:id="rIdlhlqp4zewiyhxnmyf7uaf">
+      <w:hyperlink w:history="1" r:id="rId1svkkpgma41aen1vypiwj">
         <w:r>
           <w:rPr>
             <w:rStyle w:val="Hyperlink"/>
@@ -713,25 +713,7 @@
           <w:sz w:val="21"/>
           <w:szCs w:val="21"/>
         </w:rPr>
-        <w:t xml:space="preserve">Money transfer and currency exchange platform with live rates, transaction validation, currency routing and payout workflows.</w:t>
-      </w:r>
-    </w:p>
-    <w:p>
-      <w:pPr>
-        <w:pStyle w:val="ListParagraph"/>
-        <w:numPr>
-          <w:ilvl w:val="0"/>
-          <w:numId w:val="2"/>
-        </w:numPr>
-        <w:spacing w:after="40"/>
-      </w:pPr>
-      <w:r>
-        <w:rPr>
-          <w:rFonts w:ascii="Calibri" w:cs="Calibri" w:eastAsia="Calibri" w:hAnsi="Calibri"/>
-          <w:sz w:val="21"/>
-          <w:szCs w:val="21"/>
-        </w:rPr>
-        <w:t xml:space="preserve">Java Vert.x and PostgreSQL platform with secure API integrations for payouts.</w:t>
+        <w:t xml:space="preserve">Public website for RemitCore, a money transfer and currency exchange platform, built during my development internship on the RemitCore team.</w:t>
       </w:r>
     </w:p>
     <w:p>
@@ -767,7 +749,7 @@
         </w:rPr>
         <w:t xml:space="preserve">  Â·  </w:t>
       </w:r>
-      <w:hyperlink w:history="1" r:id="rIdvj7ykd2njffcv0ein8t_i">
+      <w:hyperlink w:history="1" r:id="rIdu6hpqafh74p5sylprr8fs">
         <w:r>
           <w:rPr>
             <w:rStyle w:val="Hyperlink"/>
@@ -867,7 +849,7 @@
         </w:rPr>
         <w:t xml:space="preserve">  Â·  </w:t>
       </w:r>
-      <w:hyperlink w:history="1" r:id="rIduwnuxkr03sez5ik8hurpf">
+      <w:hyperlink w:history="1" r:id="rIdcmvdjw84kiiqql2d158j2">
         <w:r>
           <w:rPr>
             <w:rStyle w:val="Hyperlink"/>
@@ -949,7 +931,7 @@
         </w:rPr>
         <w:t xml:space="preserve">  Â·  </w:t>
       </w:r>
-      <w:hyperlink w:history="1" r:id="rId18v35omgprjkihduciaon">
+      <w:hyperlink w:history="1" r:id="rIdwnevozxcl55bwyip-ywkh">
         <w:r>
           <w:rPr>
             <w:rStyle w:val="Hyperlink"/>

</xml_diff>

<commit_message>
Remove per-project mobile app details
</commit_message>
<xml_diff>
--- a/files/Derrick-Barasa-Resume.docx
+++ b/files/Derrick-Barasa-Resume.docx
@@ -46,7 +46,7 @@
         </w:rPr>
         <w:t xml:space="preserve">Nairobi, Kenya | </w:t>
       </w:r>
-      <w:hyperlink w:history="1" r:id="rIde9-l0bs5oheahcukdfgy0">
+      <w:hyperlink w:history="1" r:id="rIdafkd0h8ap22dyejqzhb6m">
         <w:r>
           <w:rPr>
             <w:rStyle w:val="Hyperlink"/>
@@ -72,7 +72,7 @@
         <w:spacing w:after="40"/>
         <w:jc w:val="center"/>
       </w:pPr>
-      <w:hyperlink w:history="1" r:id="rIdms2bh_tw3uzgfeqnk3-ji">
+      <w:hyperlink w:history="1" r:id="rIdi9ntes3-ajynsolhgzla_">
         <w:r>
           <w:rPr>
             <w:rStyle w:val="Hyperlink"/>
@@ -92,7 +92,7 @@
         </w:rPr>
         <w:t xml:space="preserve"> | </w:t>
       </w:r>
-      <w:hyperlink w:history="1" r:id="rIdrf2mpsttubz756mgqqhb-">
+      <w:hyperlink w:history="1" r:id="rId3btoqk5oo9vwyxerurnx9">
         <w:r>
           <w:rPr>
             <w:rStyle w:val="Hyperlink"/>
@@ -112,7 +112,7 @@
         </w:rPr>
         <w:t xml:space="preserve"> | </w:t>
       </w:r>
-      <w:hyperlink w:history="1" r:id="rId2zmrvdfbz9yt87gtj4jki">
+      <w:hyperlink w:history="1" r:id="rId139on3w4lqqb1yjdsol0a">
         <w:r>
           <w:rPr>
             <w:rStyle w:val="Hyperlink"/>
@@ -585,7 +585,7 @@
         </w:rPr>
         <w:t xml:space="preserve">  Â·  </w:t>
       </w:r>
-      <w:hyperlink w:history="1" r:id="rIdvxb8smcglqkndljzgxndp">
+      <w:hyperlink w:history="1" r:id="rIdf2wr0a5sezj5wcxdmq7zq">
         <w:r>
           <w:rPr>
             <w:rStyle w:val="Hyperlink"/>
@@ -636,24 +636,6 @@
     </w:p>
     <w:p>
       <w:pPr>
-        <w:pStyle w:val="ListParagraph"/>
-        <w:numPr>
-          <w:ilvl w:val="0"/>
-          <w:numId w:val="2"/>
-        </w:numPr>
-        <w:spacing w:after="40"/>
-      </w:pPr>
-      <w:r>
-        <w:rPr>
-          <w:rFonts w:ascii="Calibri" w:cs="Calibri" w:eastAsia="Calibri" w:hAnsi="Calibri"/>
-          <w:sz w:val="21"/>
-          <w:szCs w:val="21"/>
-        </w:rPr>
-        <w:t xml:space="preserve">Built the Android mobile app in Kotlin, distributed as an APK downloaded from the platform dashboard.</w:t>
-      </w:r>
-    </w:p>
-    <w:p>
-      <w:pPr>
         <w:keepNext/>
         <w:spacing w:after="20" w:before="100"/>
       </w:pPr>
@@ -685,7 +667,7 @@
         </w:rPr>
         <w:t xml:space="preserve">  Â·  </w:t>
       </w:r>
-      <w:hyperlink w:history="1" r:id="rId1svkkpgma41aen1vypiwj">
+      <w:hyperlink w:history="1" r:id="rIdwdstyyfhizqqxrczpb8am">
         <w:r>
           <w:rPr>
             <w:rStyle w:val="Hyperlink"/>
@@ -749,7 +731,7 @@
         </w:rPr>
         <w:t xml:space="preserve">  Â·  </w:t>
       </w:r>
-      <w:hyperlink w:history="1" r:id="rIdu6hpqafh74p5sylprr8fs">
+      <w:hyperlink w:history="1" r:id="rIdzvvh_vorrrtwsqjerz3bf">
         <w:r>
           <w:rPr>
             <w:rStyle w:val="Hyperlink"/>
@@ -800,24 +782,6 @@
     </w:p>
     <w:p>
       <w:pPr>
-        <w:pStyle w:val="ListParagraph"/>
-        <w:numPr>
-          <w:ilvl w:val="0"/>
-          <w:numId w:val="2"/>
-        </w:numPr>
-        <w:spacing w:after="40"/>
-      </w:pPr>
-      <w:r>
-        <w:rPr>
-          <w:rFonts w:ascii="Calibri" w:cs="Calibri" w:eastAsia="Calibri" w:hAnsi="Calibri"/>
-          <w:sz w:val="21"/>
-          <w:szCs w:val="21"/>
-        </w:rPr>
-        <w:t xml:space="preserve">Built the Android mobile app in Flutter, distributed as an APK downloaded from the platform dashboard.</w:t>
-      </w:r>
-    </w:p>
-    <w:p>
-      <w:pPr>
         <w:keepNext/>
         <w:spacing w:after="20" w:before="100"/>
       </w:pPr>
@@ -849,7 +813,7 @@
         </w:rPr>
         <w:t xml:space="preserve">  Â·  </w:t>
       </w:r>
-      <w:hyperlink w:history="1" r:id="rIdcmvdjw84kiiqql2d158j2">
+      <w:hyperlink w:history="1" r:id="rIdmnzpcvxzxrdmrg1uo3dox">
         <w:r>
           <w:rPr>
             <w:rStyle w:val="Hyperlink"/>
@@ -931,7 +895,7 @@
         </w:rPr>
         <w:t xml:space="preserve">  Â·  </w:t>
       </w:r>
-      <w:hyperlink w:history="1" r:id="rIdwnevozxcl55bwyip-ywkh">
+      <w:hyperlink w:history="1" r:id="rIdytwqlj5ah61ovewkmca_g">
         <w:r>
           <w:rPr>
             <w:rStyle w:val="Hyperlink"/>
@@ -1192,24 +1156,6 @@
           <w:szCs w:val="21"/>
         </w:rPr>
         <w:t xml:space="preserve">Point-of-sale and order routing with digital menu management, role-based order processing and meal ticket issuance (Java Vert.x, Vue.js, PostgreSQL).</w:t>
-      </w:r>
-    </w:p>
-    <w:p>
-      <w:pPr>
-        <w:pStyle w:val="ListParagraph"/>
-        <w:numPr>
-          <w:ilvl w:val="0"/>
-          <w:numId w:val="2"/>
-        </w:numPr>
-        <w:spacing w:after="40"/>
-      </w:pPr>
-      <w:r>
-        <w:rPr>
-          <w:rFonts w:ascii="Calibri" w:cs="Calibri" w:eastAsia="Calibri" w:hAnsi="Calibri"/>
-          <w:sz w:val="21"/>
-          <w:szCs w:val="21"/>
-        </w:rPr>
-        <w:t xml:space="preserve">Companion mobile app built with Flutter.</w:t>
       </w:r>
     </w:p>
     <w:p>

</xml_diff>